<commit_message>
Pushing 4/18/26 - Module 5 Assignment
</commit_message>
<xml_diff>
--- a/module-1/Lara_M1_2Assignment.docx
+++ b/module-1/Lara_M1_2Assignment.docx
@@ -46,55 +46,14 @@
     </w:p>
     <w:p>
       <w:r>
-        <w:t>GitHub Screenshot:</w:t>
-      </w:r>
-    </w:p>
-    <w:p>
-      <w:r>
-        <w:drawing>
-          <wp:inline distT="0" distB="0" distL="0" distR="0" wp14:anchorId="0BA63CFF" wp14:editId="3824FD1E">
-            <wp:extent cx="5943600" cy="2750185"/>
-            <wp:effectExtent l="0" t="0" r="0" b="0"/>
-            <wp:docPr id="952018512" name="Picture 1"/>
-            <wp:cNvGraphicFramePr>
-              <a:graphicFrameLocks xmlns:a="http://schemas.openxmlformats.org/drawingml/2006/main" noChangeAspect="1"/>
-            </wp:cNvGraphicFramePr>
-            <a:graphic xmlns:a="http://schemas.openxmlformats.org/drawingml/2006/main">
-              <a:graphicData uri="http://schemas.openxmlformats.org/drawingml/2006/picture">
-                <pic:pic xmlns:pic="http://schemas.openxmlformats.org/drawingml/2006/picture">
-                  <pic:nvPicPr>
-                    <pic:cNvPr id="952018512" name=""/>
-                    <pic:cNvPicPr/>
-                  </pic:nvPicPr>
-                  <pic:blipFill>
-                    <a:blip r:embed="rId5"/>
-                    <a:stretch>
-                      <a:fillRect/>
-                    </a:stretch>
-                  </pic:blipFill>
-                  <pic:spPr>
-                    <a:xfrm>
-                      <a:off x="0" y="0"/>
-                      <a:ext cx="5943600" cy="2750185"/>
-                    </a:xfrm>
-                    <a:prstGeom prst="rect">
-                      <a:avLst/>
-                    </a:prstGeom>
-                  </pic:spPr>
-                </pic:pic>
-              </a:graphicData>
-            </a:graphic>
-          </wp:inline>
-        </w:drawing>
-      </w:r>
-    </w:p>
-    <w:p>
-      <w:r>
         <w:t>Directory:</w:t>
       </w:r>
     </w:p>
     <w:p>
       <w:r>
+        <w:rPr>
+          <w:noProof/>
+        </w:rPr>
         <w:drawing>
           <wp:inline distT="0" distB="0" distL="0" distR="0" wp14:anchorId="77C0B100" wp14:editId="48FFF1D9">
             <wp:extent cx="5943600" cy="3126740"/>
@@ -111,7 +70,7 @@
                     <pic:cNvPicPr/>
                   </pic:nvPicPr>
                   <pic:blipFill>
-                    <a:blip r:embed="rId6"/>
+                    <a:blip r:embed="rId5"/>
                     <a:stretch>
                       <a:fillRect/>
                     </a:stretch>
@@ -132,6 +91,51 @@
         </w:drawing>
       </w:r>
     </w:p>
+    <w:p>
+      <w:r>
+        <w:t>GitHub Screenshot:</w:t>
+      </w:r>
+    </w:p>
+    <w:p>
+      <w:r>
+        <w:drawing>
+          <wp:inline distT="0" distB="0" distL="0" distR="0" wp14:anchorId="13B6F3F9" wp14:editId="6CBA65D4">
+            <wp:extent cx="5943600" cy="2031365"/>
+            <wp:effectExtent l="0" t="0" r="0" b="6985"/>
+            <wp:docPr id="1728235146" name="Picture 1"/>
+            <wp:cNvGraphicFramePr>
+              <a:graphicFrameLocks xmlns:a="http://schemas.openxmlformats.org/drawingml/2006/main" noChangeAspect="1"/>
+            </wp:cNvGraphicFramePr>
+            <a:graphic xmlns:a="http://schemas.openxmlformats.org/drawingml/2006/main">
+              <a:graphicData uri="http://schemas.openxmlformats.org/drawingml/2006/picture">
+                <pic:pic xmlns:pic="http://schemas.openxmlformats.org/drawingml/2006/picture">
+                  <pic:nvPicPr>
+                    <pic:cNvPr id="1728235146" name=""/>
+                    <pic:cNvPicPr/>
+                  </pic:nvPicPr>
+                  <pic:blipFill>
+                    <a:blip r:embed="rId6"/>
+                    <a:stretch>
+                      <a:fillRect/>
+                    </a:stretch>
+                  </pic:blipFill>
+                  <pic:spPr>
+                    <a:xfrm>
+                      <a:off x="0" y="0"/>
+                      <a:ext cx="5943600" cy="2031365"/>
+                    </a:xfrm>
+                    <a:prstGeom prst="rect">
+                      <a:avLst/>
+                    </a:prstGeom>
+                  </pic:spPr>
+                </pic:pic>
+              </a:graphicData>
+            </a:graphic>
+          </wp:inline>
+        </w:drawing>
+      </w:r>
+    </w:p>
+    <w:p/>
     <w:sectPr>
       <w:pgSz w:w="12240" w:h="15840"/>
       <w:pgMar w:top="1440" w:right="1440" w:bottom="1440" w:left="1440" w:header="720" w:footer="720" w:gutter="0"/>

</xml_diff>